<commit_message>
add agent 01 assignment
</commit_message>
<xml_diff>
--- a/Bìa.docx
+++ b/Bìa.docx
@@ -518,41 +518,13 @@
           <w:szCs w:val="24"/>
         </w:rPr>
       </w:pPr>
-      <w:proofErr w:type="spellStart"/>
       <w:r>
         <w:rPr>
           <w:b/>
           <w:sz w:val="36"/>
           <w:szCs w:val="24"/>
         </w:rPr>
-        <w:t>Tiểu</w:t>
-      </w:r>
-      <w:proofErr w:type="spellEnd"/>
-      <w:r>
-        <w:rPr>
-          <w:b/>
-          <w:sz w:val="36"/>
-          <w:szCs w:val="24"/>
-        </w:rPr>
-        <w:t xml:space="preserve"> </w:t>
-      </w:r>
-      <w:proofErr w:type="spellStart"/>
-      <w:r>
-        <w:rPr>
-          <w:b/>
-          <w:sz w:val="36"/>
-          <w:szCs w:val="24"/>
-        </w:rPr>
-        <w:t>luận</w:t>
-      </w:r>
-      <w:proofErr w:type="spellEnd"/>
-      <w:r>
-        <w:rPr>
-          <w:b/>
-          <w:sz w:val="36"/>
-          <w:szCs w:val="24"/>
-        </w:rPr>
-        <w:t xml:space="preserve"> 03</w:t>
+        <w:t>Agent 01</w:t>
       </w:r>
     </w:p>
     <w:p>
@@ -620,7 +592,6 @@
                 <w:lang w:val="en-US"/>
               </w:rPr>
             </w:pPr>
-            <w:proofErr w:type="spellStart"/>
             <w:r>
               <w:rPr>
                 <w:rFonts w:cs="Times New Roman"/>
@@ -630,43 +601,7 @@
                 <w:szCs w:val="28"/>
                 <w:lang w:val="en-US"/>
               </w:rPr>
-              <w:t>Họ</w:t>
-            </w:r>
-            <w:proofErr w:type="spellEnd"/>
-            <w:r>
-              <w:rPr>
-                <w:rFonts w:cs="Times New Roman"/>
-                <w:b/>
-                <w:bCs/>
-                <w:sz w:val="28"/>
-                <w:szCs w:val="28"/>
-                <w:lang w:val="en-US"/>
-              </w:rPr>
-              <w:t xml:space="preserve"> </w:t>
-            </w:r>
-            <w:proofErr w:type="spellStart"/>
-            <w:r>
-              <w:rPr>
-                <w:rFonts w:cs="Times New Roman"/>
-                <w:b/>
-                <w:bCs/>
-                <w:sz w:val="28"/>
-                <w:szCs w:val="28"/>
-                <w:lang w:val="en-US"/>
-              </w:rPr>
-              <w:t>tên</w:t>
-            </w:r>
-            <w:proofErr w:type="spellEnd"/>
-            <w:r>
-              <w:rPr>
-                <w:rFonts w:cs="Times New Roman"/>
-                <w:b/>
-                <w:bCs/>
-                <w:sz w:val="28"/>
-                <w:szCs w:val="28"/>
-                <w:lang w:val="en-US"/>
-              </w:rPr>
-              <w:t>:</w:t>
+              <w:t>Họ tên:</w:t>
             </w:r>
           </w:p>
         </w:tc>
@@ -704,19 +639,8 @@
                 <w:szCs w:val="28"/>
                 <w:lang w:val="en-US"/>
               </w:rPr>
-              <w:t xml:space="preserve">Phan Văn </w:t>
+              <w:t>Phan Văn Khôi</w:t>
             </w:r>
-            <w:proofErr w:type="spellStart"/>
-            <w:r>
-              <w:rPr>
-                <w:rFonts w:cs="Times New Roman"/>
-                <w:sz w:val="28"/>
-                <w:szCs w:val="28"/>
-                <w:lang w:val="en-US"/>
-              </w:rPr>
-              <w:t>Khôi</w:t>
-            </w:r>
-            <w:proofErr w:type="spellEnd"/>
           </w:p>
         </w:tc>
         <w:tc>
@@ -759,7 +683,6 @@
                 <w:lang w:val="en-US"/>
               </w:rPr>
             </w:pPr>
-            <w:proofErr w:type="spellStart"/>
             <w:r>
               <w:rPr>
                 <w:rFonts w:cs="Times New Roman"/>
@@ -769,67 +692,7 @@
                 <w:szCs w:val="28"/>
                 <w:lang w:val="en-US"/>
               </w:rPr>
-              <w:t>Mã</w:t>
-            </w:r>
-            <w:proofErr w:type="spellEnd"/>
-            <w:r>
-              <w:rPr>
-                <w:rFonts w:cs="Times New Roman"/>
-                <w:b/>
-                <w:bCs/>
-                <w:sz w:val="28"/>
-                <w:szCs w:val="28"/>
-                <w:lang w:val="en-US"/>
-              </w:rPr>
-              <w:t xml:space="preserve"> </w:t>
-            </w:r>
-            <w:proofErr w:type="spellStart"/>
-            <w:r>
-              <w:rPr>
-                <w:rFonts w:cs="Times New Roman"/>
-                <w:b/>
-                <w:bCs/>
-                <w:sz w:val="28"/>
-                <w:szCs w:val="28"/>
-                <w:lang w:val="en-US"/>
-              </w:rPr>
-              <w:t>sinh</w:t>
-            </w:r>
-            <w:proofErr w:type="spellEnd"/>
-            <w:r>
-              <w:rPr>
-                <w:rFonts w:cs="Times New Roman"/>
-                <w:b/>
-                <w:bCs/>
-                <w:sz w:val="28"/>
-                <w:szCs w:val="28"/>
-                <w:lang w:val="en-US"/>
-              </w:rPr>
-              <w:t xml:space="preserve"> </w:t>
-            </w:r>
-            <w:proofErr w:type="spellStart"/>
-            <w:r>
-              <w:rPr>
-                <w:rFonts w:cs="Times New Roman"/>
-                <w:b/>
-                <w:bCs/>
-                <w:sz w:val="28"/>
-                <w:szCs w:val="28"/>
-                <w:lang w:val="en-US"/>
-              </w:rPr>
-              <w:t>viên</w:t>
-            </w:r>
-            <w:proofErr w:type="spellEnd"/>
-            <w:r>
-              <w:rPr>
-                <w:rFonts w:cs="Times New Roman"/>
-                <w:b/>
-                <w:bCs/>
-                <w:sz w:val="28"/>
-                <w:szCs w:val="28"/>
-                <w:lang w:val="en-US"/>
-              </w:rPr>
-              <w:t>:</w:t>
+              <w:t>Mã sinh viên:</w:t>
             </w:r>
           </w:p>
         </w:tc>
@@ -891,7 +754,6 @@
                 <w:lang w:val="en-US"/>
               </w:rPr>
             </w:pPr>
-            <w:proofErr w:type="spellStart"/>
             <w:r>
               <w:rPr>
                 <w:rFonts w:cs="Times New Roman"/>
@@ -901,19 +763,7 @@
                 <w:szCs w:val="28"/>
                 <w:lang w:val="en-US"/>
               </w:rPr>
-              <w:t>Lớp</w:t>
-            </w:r>
-            <w:proofErr w:type="spellEnd"/>
-            <w:r>
-              <w:rPr>
-                <w:rFonts w:cs="Times New Roman"/>
-                <w:b/>
-                <w:bCs/>
-                <w:sz w:val="28"/>
-                <w:szCs w:val="28"/>
-                <w:lang w:val="en-US"/>
-              </w:rPr>
-              <w:t>:</w:t>
+              <w:t>Lớp:</w:t>
             </w:r>
           </w:p>
         </w:tc>
@@ -966,7 +816,6 @@
                 <w:lang w:val="en-US"/>
               </w:rPr>
             </w:pPr>
-            <w:proofErr w:type="spellStart"/>
             <w:r>
               <w:rPr>
                 <w:rFonts w:cs="Times New Roman"/>
@@ -976,33 +825,8 @@
                 <w:szCs w:val="28"/>
                 <w:lang w:val="en-US"/>
               </w:rPr>
-              <w:t>Giảng</w:t>
+              <w:t>Giảng viên</w:t>
             </w:r>
-            <w:proofErr w:type="spellEnd"/>
-            <w:r>
-              <w:rPr>
-                <w:rFonts w:cs="Times New Roman"/>
-                <w:b/>
-                <w:bCs/>
-                <w:sz w:val="28"/>
-                <w:szCs w:val="28"/>
-                <w:lang w:val="en-US"/>
-              </w:rPr>
-              <w:t xml:space="preserve"> </w:t>
-            </w:r>
-            <w:proofErr w:type="spellStart"/>
-            <w:r>
-              <w:rPr>
-                <w:rFonts w:cs="Times New Roman"/>
-                <w:b/>
-                <w:bCs/>
-                <w:sz w:val="28"/>
-                <w:szCs w:val="28"/>
-                <w:lang w:val="en-US"/>
-              </w:rPr>
-              <w:t>viên</w:t>
-            </w:r>
-            <w:proofErr w:type="spellEnd"/>
           </w:p>
         </w:tc>
         <w:tc>
@@ -1027,27 +851,7 @@
                 <w:szCs w:val="28"/>
                 <w:lang w:val="en-US"/>
               </w:rPr>
-              <w:t xml:space="preserve">PGS. TS. </w:t>
-            </w:r>
-            <w:proofErr w:type="spellStart"/>
-            <w:r>
-              <w:rPr>
-                <w:rFonts w:cs="Times New Roman"/>
-                <w:sz w:val="28"/>
-                <w:szCs w:val="28"/>
-                <w:lang w:val="en-US"/>
-              </w:rPr>
-              <w:t>Trần</w:t>
-            </w:r>
-            <w:proofErr w:type="spellEnd"/>
-            <w:r>
-              <w:rPr>
-                <w:rFonts w:cs="Times New Roman"/>
-                <w:sz w:val="28"/>
-                <w:szCs w:val="28"/>
-                <w:lang w:val="en-US"/>
-              </w:rPr>
-              <w:t xml:space="preserve"> Đình Quế</w:t>
+              <w:t>PGS. TS. Trần Đình Quế</w:t>
             </w:r>
           </w:p>
         </w:tc>
@@ -1162,31 +966,7 @@
           <w:szCs w:val="32"/>
           <w:lang w:val="en-US"/>
         </w:rPr>
-        <w:t xml:space="preserve">Hà </w:t>
-      </w:r>
-      <w:proofErr w:type="spellStart"/>
-      <w:r>
-        <w:rPr>
-          <w:rFonts w:cs="Times New Roman"/>
-          <w:b/>
-          <w:bCs/>
-          <w:sz w:val="32"/>
-          <w:szCs w:val="32"/>
-          <w:lang w:val="en-US"/>
-        </w:rPr>
-        <w:t>Nội</w:t>
-      </w:r>
-      <w:proofErr w:type="spellEnd"/>
-      <w:r>
-        <w:rPr>
-          <w:rFonts w:cs="Times New Roman"/>
-          <w:b/>
-          <w:bCs/>
-          <w:sz w:val="32"/>
-          <w:szCs w:val="32"/>
-          <w:lang w:val="en-US"/>
-        </w:rPr>
-        <w:t xml:space="preserve"> </w:t>
+        <w:t xml:space="preserve">Hà Nội </w:t>
       </w:r>
       <w:r>
         <w:rPr>

</xml_diff>